<commit_message>
Add report generator design + modern visual redesign
- docs/REPORT_GENERATOR_SPEC.md: native-first report generator plan on SF PSS.
  Introduces Form_Answer__c child object (Flow explodes Response_Data__c JSON
  into reportable rows), Custom Report Types, Reports & Dashboards, OmniStudio
  Document Generation, subscriptions/export, permissions, and a modern design
  language. Phased roadmap.
- docs/SF_Report_Generator_Design.docx: modern Hebrew Word doc (cover page,
  refined typography, 4 diagrams incl. dashboard mockup and JSON->Form_Answer__c).
- docs/SF_Forms_Design.docx: refreshed to the new modern design language
  (modern palette, cover page, restyled diagrams).

Co-Authored-By: Claude Opus 4.8 <noreply@anthropic.com>
Claude-Session: https://claude.ai/code/session_01CFocnzbTA3ZP5Vp2aJqu7j
</commit_message>
<xml_diff>
--- a/docs/SF_Forms_Design.docx
+++ b/docs/SF_Forms_Design.docx
@@ -4,153 +4,204 @@
   <w:body>
     <w:p>
       <w:pPr>
-        <w:spacing w:after="40"/>
+        <w:spacing w:after="120" w:before="0"/>
+        <w:jc w:val="right"/>
+        <w:bidi/>
+      </w:pPr>
+    </w:p>
+    <w:p>
+      <w:pPr>
+        <w:spacing w:after="120" w:before="0"/>
+        <w:jc w:val="right"/>
+        <w:bidi/>
+      </w:pPr>
+    </w:p>
+    <w:p>
+      <w:pPr>
+        <w:spacing w:after="120" w:before="0"/>
+        <w:jc w:val="right"/>
+        <w:bidi/>
+      </w:pPr>
+    </w:p>
+    <w:p>
+      <w:pPr>
+        <w:spacing w:after="40" w:before="0"/>
         <w:jc w:val="center"/>
         <w:bidi/>
       </w:pPr>
       <w:r>
         <w:rPr>
-          <w:rFonts w:ascii="Arial" w:hAnsi="Arial" w:cs="Arial"/>
+          <w:rFonts w:ascii="Segoe UI" w:hAnsi="Segoe UI" w:cs="Segoe UI"/>
           <w:b/>
           <w:i w:val="0"/>
-          <w:color w:val="032D60"/>
-          <w:sz w:val="48"/>
+          <w:color w:val="2563EB"/>
+          <w:sz w:val="24"/>
           <w:rtl/>
         </w:rPr>
-        <w:t>מערכת לבניית, עיצוב ופרסום טפסים</w:t>
+        <w:t>SF Forms · מסמך תכנון</w:t>
       </w:r>
     </w:p>
     <w:p>
       <w:pPr>
-        <w:spacing w:after="40"/>
+        <w:spacing w:after="80" w:before="0"/>
         <w:jc w:val="center"/>
         <w:bidi/>
       </w:pPr>
       <w:r>
         <w:rPr>
-          <w:rFonts w:ascii="Arial" w:hAnsi="Arial" w:cs="Arial"/>
-          <w:b w:val="0"/>
+          <w:rFonts w:ascii="Segoe UI" w:hAnsi="Segoe UI" w:cs="Segoe UI"/>
+          <w:b/>
           <w:i w:val="0"/>
-          <w:color w:val="0176D3"/>
-          <w:sz w:val="26"/>
+          <w:color w:val="4F46E5"/>
+          <w:sz w:val="60"/>
           <w:rtl/>
         </w:rPr>
-        <w:t>“SF Forms” — אפיון ותכנון (Native-first · Salesforce PSS)</w:t>
+        <w:t>מערכת בניית ופרסום טפסים</w:t>
       </w:r>
     </w:p>
     <w:p>
       <w:pPr>
-        <w:spacing w:after="280"/>
+        <w:spacing w:after="160" w:before="0"/>
+        <w:jc w:val="center"/>
+        <w:bidi/>
+        <w:pBdr>
+          <w:bottom w:val="single" w:sz="24" w:space="4" w:color="4F46E5"/>
+        </w:pBdr>
+      </w:pPr>
+    </w:p>
+    <w:p>
+      <w:pPr>
+        <w:spacing w:after="360" w:before="0"/>
         <w:jc w:val="center"/>
         <w:bidi/>
       </w:pPr>
       <w:r>
         <w:rPr>
-          <w:rFonts w:ascii="Arial" w:hAnsi="Arial" w:cs="Arial"/>
+          <w:rFonts w:ascii="Segoe UI" w:hAnsi="Segoe UI" w:cs="Segoe UI"/>
           <w:b w:val="0"/>
           <w:i w:val="0"/>
-          <w:color w:val="54698D"/>
-          <w:sz w:val="20"/>
+          <w:color w:val="475569"/>
+          <w:sz w:val="26"/>
           <w:rtl/>
         </w:rPr>
-        <w:t>גרסה 2.0 · מסמך תכנון להצגה</w:t>
+        <w:t>בניית טפסים אינטראקטיביים ופרסומם לציבור — Native-first על גבי Salesforce PSS</w:t>
+      </w:r>
+    </w:p>
+    <w:tbl>
+      <w:tblPr>
+        <w:tblW w:type="auto" w:w="0"/>
+        <w:jc w:val="center"/>
+        <w:tblLayout w:type="autofit"/>
+        <w:tblLook w:firstColumn="1" w:firstRow="1" w:lastColumn="0" w:lastRow="0" w:noHBand="0" w:noVBand="1" w:val="04A0"/>
+      </w:tblPr>
+      <w:tblGrid>
+        <w:gridCol w:w="9638"/>
+      </w:tblGrid>
+      <w:tr>
+        <w:tc>
+          <w:tcPr>
+            <w:tcW w:type="dxa" w:w="9638"/>
+            <w:shd w:val="clear" w:fill="F1F5F9"/>
+          </w:tcPr>
+          <w:p>
+            <w:pPr>
+              <w:jc w:val="right"/>
+              <w:bidi/>
+            </w:pPr>
+            <w:r>
+              <w:rPr>
+                <w:rFonts w:ascii="Segoe UI" w:hAnsi="Segoe UI" w:cs="Segoe UI"/>
+                <w:b/>
+                <w:color w:val="0F172A"/>
+                <w:sz w:val="22"/>
+                <w:rtl/>
+              </w:rPr>
+              <w:t>גרסה 2.1 · עיצוב מודרני</w:t>
+            </w:r>
+          </w:p>
+        </w:tc>
+      </w:tr>
+    </w:tbl>
+    <w:p>
+      <w:pPr>
+        <w:spacing w:after="80" w:before="0"/>
+        <w:jc w:val="right"/>
+        <w:bidi/>
+      </w:pPr>
+    </w:p>
+    <w:p>
+      <w:r>
+        <w:br w:type="page"/>
       </w:r>
     </w:p>
     <w:p>
       <w:pPr>
-        <w:spacing w:after="80" w:before="40"/>
+        <w:spacing w:after="120" w:before="280"/>
+        <w:jc w:val="right"/>
+        <w:bidi/>
+        <w:pBdr>
+          <w:bottom w:val="single" w:sz="14" w:space="4" w:color="E2E8F0"/>
+        </w:pBdr>
+      </w:pPr>
+      <w:r>
+        <w:rPr>
+          <w:rFonts w:ascii="Segoe UI" w:hAnsi="Segoe UI" w:cs="Segoe UI"/>
+          <w:b/>
+          <w:i w:val="0"/>
+          <w:color w:val="4F46E5"/>
+          <w:sz w:val="30"/>
+          <w:rtl/>
+        </w:rPr>
+        <w:t>1   תקציר מנהלים</w:t>
+      </w:r>
+    </w:p>
+    <w:p>
+      <w:pPr>
+        <w:spacing w:after="120" w:before="0"/>
         <w:jc w:val="right"/>
         <w:bidi/>
       </w:pPr>
       <w:r>
         <w:rPr>
-          <w:rFonts w:ascii="Arial" w:hAnsi="Arial" w:cs="Arial"/>
-          <w:b/>
-          <w:i w:val="0"/>
-          <w:color w:val="032D60"/>
-          <w:sz w:val="30"/>
-          <w:rtl/>
-        </w:rPr>
-        <w:t>1. תקציר מנהלים</w:t>
-      </w:r>
-    </w:p>
-    <w:p>
-      <w:pPr>
-        <w:spacing w:after="120"/>
-        <w:jc w:val="right"/>
-        <w:bidi/>
-      </w:pPr>
-      <w:r>
-        <w:rPr>
-          <w:rFonts w:ascii="Arial" w:hAnsi="Arial" w:cs="Arial"/>
+          <w:rFonts w:ascii="Segoe UI" w:hAnsi="Segoe UI" w:cs="Segoe UI"/>
           <w:b w:val="0"/>
           <w:i w:val="0"/>
           <w:sz w:val="22"/>
           <w:rtl/>
         </w:rPr>
-        <w:t>היום קיים בפרויקט טופס בודד מקודד-קשיח (“טופס פתיחת פנייה”) שכל שינוי בו דורש כתיבת קוד. המערכת המוצעת הופכת זאת לפלטפורמה נייטיבית בתוך Salesforce: אדם לא-טכנולוגי מעצב טופס אינטראקטיבי בכלים ויזואליים, מפרסם אותו בכתובת ציבורית, והתשובות נשמרות ומנוהלות ישירות ב-Salesforce.</w:t>
+        <w:t>המערכת מאפשרת לאדם לא-טכנולוגי לעצב טופס אינטראקטיבי בכלים ויזואליים, לפרסם אותו בכתובת ציבורית, ולנהל את התשובות ישירות ב-Salesforce. הבחירה: ניצול מלא של רישוי PSS ושל היכולות המובנות — טפסים ב-OmniStudio OmniScript, פרסום דרך Experience Cloud, ושמירת תשובות באובייקט גמיש אחד (Form_Response__c).</w:t>
       </w:r>
     </w:p>
     <w:p>
       <w:pPr>
-        <w:spacing w:after="120"/>
+        <w:spacing w:after="120" w:before="280"/>
         <w:jc w:val="right"/>
         <w:bidi/>
+        <w:pBdr>
+          <w:bottom w:val="single" w:sz="14" w:space="4" w:color="E2E8F0"/>
+        </w:pBdr>
       </w:pPr>
       <w:r>
         <w:rPr>
-          <w:rFonts w:ascii="Arial" w:hAnsi="Arial" w:cs="Arial"/>
-          <w:b w:val="0"/>
+          <w:rFonts w:ascii="Segoe UI" w:hAnsi="Segoe UI" w:cs="Segoe UI"/>
+          <w:b/>
           <w:i w:val="0"/>
-          <w:sz w:val="22"/>
+          <w:color w:val="4F46E5"/>
+          <w:sz w:val="30"/>
           <w:rtl/>
         </w:rPr>
-        <w:t>הבחירה הארכיטקטונית: ניצול מלא של רישוי PSS (Public Sector Solutions) ושל היכולות המובנות — טפסים ב-OmniStudio OmniScript, פרסום ציבורי דרך Experience Cloud, שמירת תשובות באובייקט גמיש אחד (Form_Response__c), וניהול/יצירת קשר בכלים המובנים של Salesforce (Flows, Reports, Email).</w:t>
+        <w:t>2   ארכיטקטורה</w:t>
       </w:r>
     </w:p>
     <w:p>
       <w:pPr>
-        <w:spacing w:after="80" w:before="240"/>
-        <w:jc w:val="right"/>
-        <w:bidi/>
-      </w:pPr>
-      <w:r>
-        <w:rPr>
-          <w:rFonts w:ascii="Arial" w:hAnsi="Arial" w:cs="Arial"/>
-          <w:b/>
-          <w:i w:val="0"/>
-          <w:color w:val="032D60"/>
-          <w:sz w:val="30"/>
-          <w:rtl/>
-        </w:rPr>
-        <w:t>2. ארכיטקטורה כללית</w:t>
-      </w:r>
-    </w:p>
-    <w:p>
-      <w:pPr>
-        <w:spacing w:after="120"/>
-        <w:jc w:val="right"/>
-        <w:bidi/>
-      </w:pPr>
-      <w:r>
-        <w:rPr>
-          <w:rFonts w:ascii="Arial" w:hAnsi="Arial" w:cs="Arial"/>
-          <w:b w:val="0"/>
-          <w:i w:val="0"/>
-          <w:sz w:val="22"/>
-          <w:rtl/>
-        </w:rPr>
-        <w:t>כל רכיבי המערכת חיים בתוך Salesforce — ללא שרת חיצוני וללא מסד נתונים נפרד. התרשים הבא מציג את מבנה המערכת:</w:t>
-      </w:r>
-    </w:p>
-    <w:p>
-      <w:pPr>
+        <w:spacing w:before="80"/>
         <w:jc w:val="center"/>
       </w:pPr>
       <w:r>
         <w:drawing>
           <wp:inline xmlns:a="http://schemas.openxmlformats.org/drawingml/2006/main" xmlns:pic="http://schemas.openxmlformats.org/drawingml/2006/picture">
-            <wp:extent cx="5580000" cy="3559453"/>
+            <wp:extent cx="5760000" cy="3573474"/>
             <wp:docPr id="1" name="Picture 1"/>
             <wp:cNvGraphicFramePr>
               <a:graphicFrameLocks noChangeAspect="1"/>
@@ -159,7 +210,7 @@
               <a:graphicData uri="http://schemas.openxmlformats.org/drawingml/2006/picture">
                 <pic:pic>
                   <pic:nvPicPr>
-                    <pic:cNvPr id="0" name="diag1_architecture.png"/>
+                    <pic:cNvPr id="0" name="m_f_arch.png"/>
                     <pic:cNvPicPr/>
                   </pic:nvPicPr>
                   <pic:blipFill>
@@ -171,7 +222,7 @@
                   <pic:spPr>
                     <a:xfrm>
                       <a:off x="0" y="0"/>
-                      <a:ext cx="5580000" cy="3559453"/>
+                      <a:ext cx="5760000" cy="3573474"/>
                     </a:xfrm>
                     <a:prstGeom prst="rect"/>
                   </pic:spPr>
@@ -184,16 +235,16 @@
     </w:p>
     <w:p>
       <w:pPr>
-        <w:spacing w:after="200"/>
+        <w:spacing w:after="200" w:before="0"/>
         <w:jc w:val="center"/>
         <w:bidi/>
       </w:pPr>
       <w:r>
         <w:rPr>
-          <w:rFonts w:ascii="Arial" w:hAnsi="Arial" w:cs="Arial"/>
+          <w:rFonts w:ascii="Segoe UI" w:hAnsi="Segoe UI" w:cs="Segoe UI"/>
           <w:b w:val="0"/>
           <w:i/>
-          <w:color w:val="54698D"/>
+          <w:color w:val="94A3B8"/>
           <w:sz w:val="19"/>
           <w:rtl/>
         </w:rPr>
@@ -202,143 +253,34 @@
     </w:p>
     <w:p>
       <w:pPr>
-        <w:spacing w:after="80" w:before="240"/>
+        <w:spacing w:after="120" w:before="280"/>
         <w:jc w:val="right"/>
         <w:bidi/>
+        <w:pBdr>
+          <w:bottom w:val="single" w:sz="14" w:space="4" w:color="E2E8F0"/>
+        </w:pBdr>
       </w:pPr>
       <w:r>
         <w:rPr>
-          <w:rFonts w:ascii="Arial" w:hAnsi="Arial" w:cs="Arial"/>
+          <w:rFonts w:ascii="Segoe UI" w:hAnsi="Segoe UI" w:cs="Segoe UI"/>
           <w:b/>
           <w:i w:val="0"/>
-          <w:color w:val="032D60"/>
+          <w:color w:val="4F46E5"/>
           <w:sz w:val="30"/>
           <w:rtl/>
         </w:rPr>
-        <w:t>3. פרסונות</w:t>
+        <w:t>3   זרימת שליחת טופס</w:t>
       </w:r>
     </w:p>
     <w:p>
       <w:pPr>
-        <w:pStyle w:val="ListBullet"/>
-        <w:spacing w:after="60"/>
-        <w:jc w:val="right"/>
-        <w:bidi/>
-      </w:pPr>
-      <w:r>
-        <w:rPr>
-          <w:rFonts w:ascii="Arial" w:hAnsi="Arial" w:cs="Arial"/>
-          <w:b/>
-          <w:color w:val="032D60"/>
-          <w:sz w:val="22"/>
-          <w:rtl/>
-        </w:rPr>
-        <w:t xml:space="preserve">בונה טפסים — </w:t>
-      </w:r>
-      <w:r>
-        <w:rPr>
-          <w:rFonts w:ascii="Arial" w:hAnsi="Arial" w:cs="Arial"/>
-          <w:sz w:val="22"/>
-          <w:rtl/>
-        </w:rPr>
-        <w:t>עובד לא-טכנולוגי המעצב ומפרסם טפסים; מתחבר דרך Salesforce.</w:t>
-      </w:r>
-    </w:p>
-    <w:p>
-      <w:pPr>
-        <w:pStyle w:val="ListBullet"/>
-        <w:spacing w:after="60"/>
-        <w:jc w:val="right"/>
-        <w:bidi/>
-      </w:pPr>
-      <w:r>
-        <w:rPr>
-          <w:rFonts w:ascii="Arial" w:hAnsi="Arial" w:cs="Arial"/>
-          <w:b/>
-          <w:color w:val="032D60"/>
-          <w:sz w:val="22"/>
-          <w:rtl/>
-        </w:rPr>
-        <w:t xml:space="preserve">פונה / נרשם — </w:t>
-      </w:r>
-      <w:r>
-        <w:rPr>
-          <w:rFonts w:ascii="Arial" w:hAnsi="Arial" w:cs="Arial"/>
-          <w:sz w:val="22"/>
-          <w:rtl/>
-        </w:rPr>
-        <w:t>משתמש מהציבור הממלא טופס פומבי, ללא הזדהות (Guest User).</w:t>
-      </w:r>
-    </w:p>
-    <w:p>
-      <w:pPr>
-        <w:pStyle w:val="ListBullet"/>
-        <w:spacing w:after="60"/>
-        <w:jc w:val="right"/>
-        <w:bidi/>
-      </w:pPr>
-      <w:r>
-        <w:rPr>
-          <w:rFonts w:ascii="Arial" w:hAnsi="Arial" w:cs="Arial"/>
-          <w:b/>
-          <w:color w:val="032D60"/>
-          <w:sz w:val="22"/>
-          <w:rtl/>
-        </w:rPr>
-        <w:t xml:space="preserve">מנהל — </w:t>
-      </w:r>
-      <w:r>
-        <w:rPr>
-          <w:rFonts w:ascii="Arial" w:hAnsi="Arial" w:cs="Arial"/>
-          <w:sz w:val="22"/>
-          <w:rtl/>
-        </w:rPr>
-        <w:t>עובד ה-CRM המנהל תשובות, מסנן, יוצר קשר ומפיק דוחות בתוך Salesforce.</w:t>
-      </w:r>
-    </w:p>
-    <w:p>
-      <w:pPr>
-        <w:spacing w:after="80" w:before="240"/>
-        <w:jc w:val="right"/>
-        <w:bidi/>
-      </w:pPr>
-      <w:r>
-        <w:rPr>
-          <w:rFonts w:ascii="Arial" w:hAnsi="Arial" w:cs="Arial"/>
-          <w:b/>
-          <w:i w:val="0"/>
-          <w:color w:val="032D60"/>
-          <w:sz w:val="30"/>
-          <w:rtl/>
-        </w:rPr>
-        <w:t>4. זרימת שליחת טופס</w:t>
-      </w:r>
-    </w:p>
-    <w:p>
-      <w:pPr>
-        <w:spacing w:after="120"/>
-        <w:jc w:val="right"/>
-        <w:bidi/>
-      </w:pPr>
-      <w:r>
-        <w:rPr>
-          <w:rFonts w:ascii="Arial" w:hAnsi="Arial" w:cs="Arial"/>
-          <w:b w:val="0"/>
-          <w:i w:val="0"/>
-          <w:sz w:val="22"/>
-          <w:rtl/>
-        </w:rPr>
-        <w:t>משלב מילוי הטופס ועד ניהול התשובה ב-Salesforce:</w:t>
-      </w:r>
-    </w:p>
-    <w:p>
-      <w:pPr>
+        <w:spacing w:before="80"/>
         <w:jc w:val="center"/>
       </w:pPr>
       <w:r>
         <w:drawing>
           <wp:inline xmlns:a="http://schemas.openxmlformats.org/drawingml/2006/main" xmlns:pic="http://schemas.openxmlformats.org/drawingml/2006/picture">
-            <wp:extent cx="4140000" cy="3650794"/>
+            <wp:extent cx="5940000" cy="2376000"/>
             <wp:docPr id="2" name="Picture 2"/>
             <wp:cNvGraphicFramePr>
               <a:graphicFrameLocks noChangeAspect="1"/>
@@ -347,7 +289,7 @@
               <a:graphicData uri="http://schemas.openxmlformats.org/drawingml/2006/picture">
                 <pic:pic>
                   <pic:nvPicPr>
-                    <pic:cNvPr id="0" name="diag2_flow.png"/>
+                    <pic:cNvPr id="0" name="m_f_flow.png"/>
                     <pic:cNvPicPr/>
                   </pic:nvPicPr>
                   <pic:blipFill>
@@ -359,7 +301,7 @@
                   <pic:spPr>
                     <a:xfrm>
                       <a:off x="0" y="0"/>
-                      <a:ext cx="4140000" cy="3650794"/>
+                      <a:ext cx="5940000" cy="2376000"/>
                     </a:xfrm>
                     <a:prstGeom prst="rect"/>
                   </pic:spPr>
@@ -372,16 +314,16 @@
     </w:p>
     <w:p>
       <w:pPr>
-        <w:spacing w:after="200"/>
+        <w:spacing w:after="200" w:before="0"/>
         <w:jc w:val="center"/>
         <w:bidi/>
       </w:pPr>
       <w:r>
         <w:rPr>
-          <w:rFonts w:ascii="Arial" w:hAnsi="Arial" w:cs="Arial"/>
+          <w:rFonts w:ascii="Segoe UI" w:hAnsi="Segoe UI" w:cs="Segoe UI"/>
           <w:b w:val="0"/>
           <w:i/>
-          <w:color w:val="54698D"/>
+          <w:color w:val="94A3B8"/>
           <w:sz w:val="19"/>
           <w:rtl/>
         </w:rPr>
@@ -390,47 +332,51 @@
     </w:p>
     <w:p>
       <w:pPr>
-        <w:spacing w:after="80" w:before="240"/>
+        <w:spacing w:after="120" w:before="280"/>
+        <w:jc w:val="right"/>
+        <w:bidi/>
+        <w:pBdr>
+          <w:bottom w:val="single" w:sz="14" w:space="4" w:color="E2E8F0"/>
+        </w:pBdr>
+      </w:pPr>
+      <w:r>
+        <w:rPr>
+          <w:rFonts w:ascii="Segoe UI" w:hAnsi="Segoe UI" w:cs="Segoe UI"/>
+          <w:b/>
+          <w:i w:val="0"/>
+          <w:color w:val="4F46E5"/>
+          <w:sz w:val="30"/>
+          <w:rtl/>
+        </w:rPr>
+        <w:t>4   לוגיקה מותנית</w:t>
+      </w:r>
+    </w:p>
+    <w:p>
+      <w:pPr>
+        <w:spacing w:after="120" w:before="0"/>
         <w:jc w:val="right"/>
         <w:bidi/>
       </w:pPr>
       <w:r>
         <w:rPr>
-          <w:rFonts w:ascii="Arial" w:hAnsi="Arial" w:cs="Arial"/>
-          <w:b/>
-          <w:i w:val="0"/>
-          <w:color w:val="032D60"/>
-          <w:sz w:val="30"/>
-          <w:rtl/>
-        </w:rPr>
-        <w:t>5. מודל הנתונים ב-Salesforce</w:t>
-      </w:r>
-    </w:p>
-    <w:p>
-      <w:pPr>
-        <w:spacing w:after="120"/>
-        <w:jc w:val="right"/>
-        <w:bidi/>
-      </w:pPr>
-      <w:r>
-        <w:rPr>
-          <w:rFonts w:ascii="Arial" w:hAnsi="Arial" w:cs="Arial"/>
+          <w:rFonts w:ascii="Segoe UI" w:hAnsi="Segoe UI" w:cs="Segoe UI"/>
           <w:b w:val="0"/>
           <w:i w:val="0"/>
           <w:sz w:val="22"/>
           <w:rtl/>
         </w:rPr>
-        <w:t>כל התשובות מכל הטפסים נשמרות באובייקט Custom גמיש אחד. שדות-מפתח (שם, אימייל, טלפון, נושא) ממופים במפורש, וכל שאר התשובות נשמרות כ-JSON בשדה Response_Data__c. כך ניתן לבנות כל טופס חדש בלי לשנות את סכמת Salesforce.</w:t>
+        <w:t>הצגה/הסתרה של שדות בהתאם לבחירה — נייטיבית ב-OmniScript, ללא קוד.</w:t>
       </w:r>
     </w:p>
     <w:p>
       <w:pPr>
+        <w:spacing w:before="80"/>
         <w:jc w:val="center"/>
       </w:pPr>
       <w:r>
         <w:drawing>
           <wp:inline xmlns:a="http://schemas.openxmlformats.org/drawingml/2006/main" xmlns:pic="http://schemas.openxmlformats.org/drawingml/2006/picture">
-            <wp:extent cx="5040000" cy="3843423"/>
+            <wp:extent cx="4680000" cy="2321604"/>
             <wp:docPr id="3" name="Picture 3"/>
             <wp:cNvGraphicFramePr>
               <a:graphicFrameLocks noChangeAspect="1"/>
@@ -439,7 +385,7 @@
               <a:graphicData uri="http://schemas.openxmlformats.org/drawingml/2006/picture">
                 <pic:pic>
                   <pic:nvPicPr>
-                    <pic:cNvPr id="0" name="diag3_datamodel.png"/>
+                    <pic:cNvPr id="0" name="m_f_conditional.png"/>
                     <pic:cNvPicPr/>
                   </pic:nvPicPr>
                   <pic:blipFill>
@@ -451,7 +397,7 @@
                   <pic:spPr>
                     <a:xfrm>
                       <a:off x="0" y="0"/>
-                      <a:ext cx="5040000" cy="3843423"/>
+                      <a:ext cx="4680000" cy="2321604"/>
                     </a:xfrm>
                     <a:prstGeom prst="rect"/>
                   </pic:spPr>
@@ -464,164 +410,52 @@
     </w:p>
     <w:p>
       <w:pPr>
-        <w:spacing w:after="200"/>
+        <w:spacing w:after="200" w:before="0"/>
         <w:jc w:val="center"/>
         <w:bidi/>
       </w:pPr>
       <w:r>
         <w:rPr>
-          <w:rFonts w:ascii="Arial" w:hAnsi="Arial" w:cs="Arial"/>
+          <w:rFonts w:ascii="Segoe UI" w:hAnsi="Segoe UI" w:cs="Segoe UI"/>
           <w:b w:val="0"/>
           <w:i/>
-          <w:color w:val="54698D"/>
+          <w:color w:val="94A3B8"/>
           <w:sz w:val="19"/>
           <w:rtl/>
         </w:rPr>
-        <w:t>תרשים 3 — האובייקט Form_Response__c</w:t>
+        <w:t>תרשים 3 — דוגמה ללוגיקה מותנית</w:t>
       </w:r>
     </w:p>
     <w:p>
       <w:pPr>
-        <w:spacing w:after="80" w:before="240"/>
+        <w:spacing w:after="120" w:before="280"/>
         <w:jc w:val="right"/>
         <w:bidi/>
+        <w:pBdr>
+          <w:bottom w:val="single" w:sz="14" w:space="4" w:color="E2E8F0"/>
+        </w:pBdr>
       </w:pPr>
       <w:r>
         <w:rPr>
-          <w:rFonts w:ascii="Arial" w:hAnsi="Arial" w:cs="Arial"/>
+          <w:rFonts w:ascii="Segoe UI" w:hAnsi="Segoe UI" w:cs="Segoe UI"/>
           <w:b/>
           <w:i w:val="0"/>
-          <w:color w:val="032D60"/>
+          <w:color w:val="4F46E5"/>
           <w:sz w:val="30"/>
           <w:rtl/>
         </w:rPr>
-        <w:t>6. סוגי שדות וּולידציות</w:t>
+        <w:t>5   דוגמה: טופס רישום לאירוע</w:t>
       </w:r>
     </w:p>
     <w:p>
       <w:pPr>
-        <w:spacing w:after="120"/>
-        <w:jc w:val="right"/>
-        <w:bidi/>
-      </w:pPr>
-      <w:r>
-        <w:rPr>
-          <w:rFonts w:ascii="Arial" w:hAnsi="Arial" w:cs="Arial"/>
-          <w:b w:val="0"/>
-          <w:i w:val="0"/>
-          <w:sz w:val="22"/>
-          <w:rtl/>
-        </w:rPr>
-        <w:t>סוגי שדות נתמכים (רכיבי OmniScript): טקסט קצר/ארוך, אימייל, טלפון, מספר, תאריך/שעה, רשימה נפתחת, בחירה יחידה/מרובה, דירוג, העלאת קובץ, כותרות/מקטעים, שדה הסכמה (פרטיות) ושדה מוסתר.</w:t>
-      </w:r>
-    </w:p>
-    <w:p>
-      <w:pPr>
-        <w:pStyle w:val="ListBullet"/>
-        <w:spacing w:after="60"/>
-        <w:jc w:val="right"/>
-        <w:bidi/>
-      </w:pPr>
-      <w:r>
-        <w:rPr>
-          <w:rFonts w:ascii="Arial" w:hAnsi="Arial" w:cs="Arial"/>
-          <w:sz w:val="22"/>
-          <w:rtl/>
-        </w:rPr>
-        <w:t>חובה, אורך מינימלי/מקסימלי, טווחי ערכים ותאריכים.</w:t>
-      </w:r>
-    </w:p>
-    <w:p>
-      <w:pPr>
-        <w:pStyle w:val="ListBullet"/>
-        <w:spacing w:after="60"/>
-        <w:jc w:val="right"/>
-        <w:bidi/>
-      </w:pPr>
-      <w:r>
-        <w:rPr>
-          <w:rFonts w:ascii="Arial" w:hAnsi="Arial" w:cs="Arial"/>
-          <w:sz w:val="22"/>
-          <w:rtl/>
-        </w:rPr>
-        <w:t>פורמטים: אימייל, טלפון (ישראלי), regex מותאם.</w:t>
-      </w:r>
-    </w:p>
-    <w:p>
-      <w:pPr>
-        <w:pStyle w:val="ListBullet"/>
-        <w:spacing w:after="60"/>
-        <w:jc w:val="right"/>
-        <w:bidi/>
-      </w:pPr>
-      <w:r>
-        <w:rPr>
-          <w:rFonts w:ascii="Arial" w:hAnsi="Arial" w:cs="Arial"/>
-          <w:sz w:val="22"/>
-          <w:rtl/>
-        </w:rPr>
-        <w:t>ולידציות מורכבות / חוצות-שדות דרך Business Rules Engine (PSS).</w:t>
-      </w:r>
-    </w:p>
-    <w:p>
-      <w:pPr>
-        <w:pStyle w:val="ListBullet"/>
-        <w:spacing w:after="60"/>
-        <w:jc w:val="right"/>
-        <w:bidi/>
-      </w:pPr>
-      <w:r>
-        <w:rPr>
-          <w:rFonts w:ascii="Arial" w:hAnsi="Arial" w:cs="Arial"/>
-          <w:sz w:val="22"/>
-          <w:rtl/>
-        </w:rPr>
-        <w:t>אכיפה כפולה: בטופס (חוויית משתמש) וגם בעת השמירה — לא סומכים על הקלט בלבד.</w:t>
-      </w:r>
-    </w:p>
-    <w:p>
-      <w:pPr>
-        <w:spacing w:after="80" w:before="240"/>
-        <w:jc w:val="right"/>
-        <w:bidi/>
-      </w:pPr>
-      <w:r>
-        <w:rPr>
-          <w:rFonts w:ascii="Arial" w:hAnsi="Arial" w:cs="Arial"/>
-          <w:b/>
-          <w:i w:val="0"/>
-          <w:color w:val="032D60"/>
-          <w:sz w:val="30"/>
-          <w:rtl/>
-        </w:rPr>
-        <w:t>7. לוגיקה מותנית</w:t>
-      </w:r>
-    </w:p>
-    <w:p>
-      <w:pPr>
-        <w:spacing w:after="120"/>
-        <w:jc w:val="right"/>
-        <w:bidi/>
-      </w:pPr>
-      <w:r>
-        <w:rPr>
-          <w:rFonts w:ascii="Arial" w:hAnsi="Arial" w:cs="Arial"/>
-          <w:b w:val="0"/>
-          <w:i w:val="0"/>
-          <w:sz w:val="22"/>
-          <w:rtl/>
-        </w:rPr>
-        <w:t>הצגה/הסתרה של שדות (או הפיכתם לחובה) בהתאם לבחירה — נייטיבית ב-OmniScript, ללא קוד. דוגמה: השדה “כתובת איסוף” מוצג רק כאשר “צריך הסעה” = כן.</w:t>
-      </w:r>
-    </w:p>
-    <w:p>
-      <w:pPr>
+        <w:spacing w:before="80"/>
         <w:jc w:val="center"/>
       </w:pPr>
       <w:r>
         <w:drawing>
           <wp:inline xmlns:a="http://schemas.openxmlformats.org/drawingml/2006/main" xmlns:pic="http://schemas.openxmlformats.org/drawingml/2006/picture">
-            <wp:extent cx="4680000" cy="2473490"/>
+            <wp:extent cx="3960000" cy="4291803"/>
             <wp:docPr id="4" name="Picture 4"/>
             <wp:cNvGraphicFramePr>
               <a:graphicFrameLocks noChangeAspect="1"/>
@@ -630,7 +464,7 @@
               <a:graphicData uri="http://schemas.openxmlformats.org/drawingml/2006/picture">
                 <pic:pic>
                   <pic:nvPicPr>
-                    <pic:cNvPr id="0" name="diag5_conditional.png"/>
+                    <pic:cNvPr id="0" name="m_f_form.png"/>
                     <pic:cNvPicPr/>
                   </pic:nvPicPr>
                   <pic:blipFill>
@@ -642,7 +476,7 @@
                   <pic:spPr>
                     <a:xfrm>
                       <a:off x="0" y="0"/>
-                      <a:ext cx="4680000" cy="2473490"/>
+                      <a:ext cx="3960000" cy="4291803"/>
                     </a:xfrm>
                     <a:prstGeom prst="rect"/>
                   </pic:spPr>
@@ -655,130 +489,41 @@
     </w:p>
     <w:p>
       <w:pPr>
-        <w:spacing w:after="200"/>
+        <w:spacing w:after="200" w:before="0"/>
         <w:jc w:val="center"/>
         <w:bidi/>
       </w:pPr>
       <w:r>
         <w:rPr>
-          <w:rFonts w:ascii="Arial" w:hAnsi="Arial" w:cs="Arial"/>
+          <w:rFonts w:ascii="Segoe UI" w:hAnsi="Segoe UI" w:cs="Segoe UI"/>
           <w:b w:val="0"/>
           <w:i/>
-          <w:color w:val="54698D"/>
+          <w:color w:val="94A3B8"/>
           <w:sz w:val="19"/>
           <w:rtl/>
         </w:rPr>
-        <w:t>תרשים 4 — דוגמה ללוגיקה מותנית</w:t>
+        <w:t>תרשים 4 — המחשת טופס עם שדה מותנה (עיצוב מודרני)</w:t>
       </w:r>
     </w:p>
     <w:p>
       <w:pPr>
-        <w:spacing w:after="80" w:before="240"/>
+        <w:spacing w:after="120" w:before="280"/>
         <w:jc w:val="right"/>
         <w:bidi/>
+        <w:pBdr>
+          <w:bottom w:val="single" w:sz="14" w:space="4" w:color="E2E8F0"/>
+        </w:pBdr>
       </w:pPr>
       <w:r>
         <w:rPr>
-          <w:rFonts w:ascii="Arial" w:hAnsi="Arial" w:cs="Arial"/>
+          <w:rFonts w:ascii="Segoe UI" w:hAnsi="Segoe UI" w:cs="Segoe UI"/>
           <w:b/>
           <w:i w:val="0"/>
-          <w:color w:val="032D60"/>
+          <w:color w:val="4F46E5"/>
           <w:sz w:val="30"/>
           <w:rtl/>
         </w:rPr>
-        <w:t>8. דוגמה: טופס רישום לאירוע</w:t>
-      </w:r>
-    </w:p>
-    <w:p>
-      <w:pPr>
-        <w:spacing w:after="120"/>
-        <w:jc w:val="right"/>
-        <w:bidi/>
-      </w:pPr>
-      <w:r>
-        <w:rPr>
-          <w:rFonts w:ascii="Arial" w:hAnsi="Arial" w:cs="Arial"/>
-          <w:b w:val="0"/>
-          <w:i w:val="0"/>
-          <w:sz w:val="22"/>
-          <w:rtl/>
-        </w:rPr>
-        <w:t>להלן המחשה של טופס שנבנה במערכת — רישום לאירוע, כולל שדה מותנה (“כתובת איסוף”) שמופיע רק כשנבחר “צריך הסעה = כן”:</w:t>
-      </w:r>
-    </w:p>
-    <w:p>
-      <w:pPr>
-        <w:jc w:val="center"/>
-      </w:pPr>
-      <w:r>
-        <w:drawing>
-          <wp:inline xmlns:a="http://schemas.openxmlformats.org/drawingml/2006/main" xmlns:pic="http://schemas.openxmlformats.org/drawingml/2006/picture">
-            <wp:extent cx="3960000" cy="4247859"/>
-            <wp:docPr id="5" name="Picture 5"/>
-            <wp:cNvGraphicFramePr>
-              <a:graphicFrameLocks noChangeAspect="1"/>
-            </wp:cNvGraphicFramePr>
-            <a:graphic>
-              <a:graphicData uri="http://schemas.openxmlformats.org/drawingml/2006/picture">
-                <pic:pic>
-                  <pic:nvPicPr>
-                    <pic:cNvPr id="0" name="diag4_form_mockup.png"/>
-                    <pic:cNvPicPr/>
-                  </pic:nvPicPr>
-                  <pic:blipFill>
-                    <a:blip r:embed="rId13"/>
-                    <a:stretch>
-                      <a:fillRect/>
-                    </a:stretch>
-                  </pic:blipFill>
-                  <pic:spPr>
-                    <a:xfrm>
-                      <a:off x="0" y="0"/>
-                      <a:ext cx="3960000" cy="4247859"/>
-                    </a:xfrm>
-                    <a:prstGeom prst="rect"/>
-                  </pic:spPr>
-                </pic:pic>
-              </a:graphicData>
-            </a:graphic>
-          </wp:inline>
-        </w:drawing>
-      </w:r>
-    </w:p>
-    <w:p>
-      <w:pPr>
-        <w:spacing w:after="200"/>
-        <w:jc w:val="center"/>
-        <w:bidi/>
-      </w:pPr>
-      <w:r>
-        <w:rPr>
-          <w:rFonts w:ascii="Arial" w:hAnsi="Arial" w:cs="Arial"/>
-          <w:b w:val="0"/>
-          <w:i/>
-          <w:color w:val="54698D"/>
-          <w:sz w:val="19"/>
-          <w:rtl/>
-        </w:rPr>
-        <w:t>תרשים 5 — המחשת טופס רישום לאירוע (עם שדה מותנה)</w:t>
-      </w:r>
-    </w:p>
-    <w:p>
-      <w:pPr>
-        <w:spacing w:after="80" w:before="240"/>
-        <w:jc w:val="right"/>
-        <w:bidi/>
-      </w:pPr>
-      <w:r>
-        <w:rPr>
-          <w:rFonts w:ascii="Arial" w:hAnsi="Arial" w:cs="Arial"/>
-          <w:b/>
-          <w:i w:val="0"/>
-          <w:color w:val="032D60"/>
-          <w:sz w:val="30"/>
-          <w:rtl/>
-        </w:rPr>
-        <w:t>9. עיצוב, פרסום ואבטחה</w:t>
+        <w:t>6   שפת עיצוב מודרנית ומפת דרכים</w:t>
       </w:r>
     </w:p>
     <w:p>
@@ -790,9 +535,9 @@
       </w:pPr>
       <w:r>
         <w:rPr>
-          <w:rFonts w:ascii="Arial" w:hAnsi="Arial" w:cs="Arial"/>
+          <w:rFonts w:ascii="Segoe UI" w:hAnsi="Segoe UI" w:cs="Segoe UI"/>
           <w:b/>
-          <w:color w:val="032D60"/>
+          <w:color w:val="2563EB"/>
           <w:sz w:val="22"/>
           <w:rtl/>
         </w:rPr>
@@ -800,11 +545,11 @@
       </w:r>
       <w:r>
         <w:rPr>
-          <w:rFonts w:ascii="Arial" w:hAnsi="Arial" w:cs="Arial"/>
+          <w:rFonts w:ascii="Segoe UI" w:hAnsi="Segoe UI" w:cs="Segoe UI"/>
           <w:sz w:val="22"/>
           <w:rtl/>
         </w:rPr>
-        <w:t>עיצוב עקבי ונגיש עם SLDS, מיתוג אחיד (Experience CMS Brand), תמיכת RTL, לוגו וצבעים מותאמים.</w:t>
+        <w:t>פלטה מודרנית (אינדיגו/כחול/טורקיז), גופן sans עדכני, כרטיסים מעוגלים, RTL ונגישות AA.</w:t>
       </w:r>
     </w:p>
     <w:p>
@@ -816,205 +561,64 @@
       </w:pPr>
       <w:r>
         <w:rPr>
-          <w:rFonts w:ascii="Arial" w:hAnsi="Arial" w:cs="Arial"/>
+          <w:rFonts w:ascii="Segoe UI" w:hAnsi="Segoe UI" w:cs="Segoe UI"/>
           <w:b/>
-          <w:color w:val="032D60"/>
+          <w:color w:val="2563EB"/>
           <w:sz w:val="22"/>
           <w:rtl/>
         </w:rPr>
-        <w:t xml:space="preserve">פרסום — </w:t>
+        <w:t xml:space="preserve">שלבים — </w:t>
       </w:r>
       <w:r>
         <w:rPr>
-          <w:rFonts w:ascii="Arial" w:hAnsi="Arial" w:cs="Arial"/>
+          <w:rFonts w:ascii="Segoe UI" w:hAnsi="Segoe UI" w:cs="Segoe UI"/>
           <w:sz w:val="22"/>
           <w:rtl/>
         </w:rPr>
-        <w:t>אתר Experience Cloud עם גישת אורח; כתובת ציבורית לכל טופס; ניהול גרסאות (טיוטה/פרסום); תאריכי פתיחה/סגירה ומכסות.</w:t>
+        <w:t>MVP: Form_Response__c + OmniScript + פרסום; שלב 2: לוגיקה מותנית, קבצים, אירועים; שלב 3: הרחבות ומחולל דוחות.</w:t>
       </w:r>
     </w:p>
+    <w:tbl>
+      <w:tblPr>
+        <w:tblW w:type="auto" w:w="0"/>
+        <w:jc w:val="center"/>
+        <w:tblLayout w:type="autofit"/>
+        <w:tblLook w:firstColumn="1" w:firstRow="1" w:lastColumn="0" w:lastRow="0" w:noHBand="0" w:noVBand="1" w:val="04A0"/>
+      </w:tblPr>
+      <w:tblGrid>
+        <w:gridCol w:w="9638"/>
+      </w:tblGrid>
+      <w:tr>
+        <w:tc>
+          <w:tcPr>
+            <w:tcW w:type="dxa" w:w="9638"/>
+            <w:shd w:val="clear" w:fill="EEF2FF"/>
+          </w:tcPr>
+          <w:p>
+            <w:pPr>
+              <w:jc w:val="right"/>
+              <w:bidi/>
+            </w:pPr>
+            <w:r>
+              <w:rPr>
+                <w:rFonts w:ascii="Segoe UI" w:hAnsi="Segoe UI" w:cs="Segoe UI"/>
+                <w:b/>
+                <w:color w:val="0F172A"/>
+                <w:sz w:val="22"/>
+                <w:rtl/>
+              </w:rPr>
+              <w:t>מחולל הדוחות מתועד בנפרד במסמך “מחולל הדוחות — תכנון פיתוח”.</w:t>
+            </w:r>
+          </w:p>
+        </w:tc>
+      </w:tr>
+    </w:tbl>
     <w:p>
       <w:pPr>
-        <w:pStyle w:val="ListBullet"/>
-        <w:spacing w:after="60"/>
+        <w:spacing w:after="80" w:before="0"/>
         <w:jc w:val="right"/>
         <w:bidi/>
       </w:pPr>
-      <w:r>
-        <w:rPr>
-          <w:rFonts w:ascii="Arial" w:hAnsi="Arial" w:cs="Arial"/>
-          <w:b/>
-          <w:color w:val="032D60"/>
-          <w:sz w:val="22"/>
-          <w:rtl/>
-        </w:rPr>
-        <w:t xml:space="preserve">אבטחה — </w:t>
-      </w:r>
-      <w:r>
-        <w:rPr>
-          <w:rFonts w:ascii="Arial" w:hAnsi="Arial" w:cs="Arial"/>
-          <w:sz w:val="22"/>
-          <w:rtl/>
-        </w:rPr>
-        <w:t>הרשאות מינימום ל-Guest (create בלבד), כללי שיתוף, הגנת ספאם, ולידציה בשרת, והתאמה לחוק הגנת הפרטיות / GDPR.</w:t>
-      </w:r>
-    </w:p>
-    <w:p>
-      <w:pPr>
-        <w:spacing w:after="80" w:before="240"/>
-        <w:jc w:val="right"/>
-        <w:bidi/>
-      </w:pPr>
-      <w:r>
-        <w:rPr>
-          <w:rFonts w:ascii="Arial" w:hAnsi="Arial" w:cs="Arial"/>
-          <w:b/>
-          <w:i w:val="0"/>
-          <w:color w:val="032D60"/>
-          <w:sz w:val="30"/>
-          <w:rtl/>
-        </w:rPr>
-        <w:t>10. מפת דרכים</w:t>
-      </w:r>
-    </w:p>
-    <w:p>
-      <w:pPr>
-        <w:pStyle w:val="ListBullet"/>
-        <w:spacing w:after="60"/>
-        <w:jc w:val="right"/>
-        <w:bidi/>
-      </w:pPr>
-      <w:r>
-        <w:rPr>
-          <w:rFonts w:ascii="Arial" w:hAnsi="Arial" w:cs="Arial"/>
-          <w:b/>
-          <w:color w:val="032D60"/>
-          <w:sz w:val="22"/>
-          <w:rtl/>
-        </w:rPr>
-        <w:t xml:space="preserve">שלב 0 — </w:t>
-      </w:r>
-      <w:r>
-        <w:rPr>
-          <w:rFonts w:ascii="Arial" w:hAnsi="Arial" w:cs="Arial"/>
-          <w:sz w:val="22"/>
-          <w:rtl/>
-        </w:rPr>
-        <w:t>אפיון (המסמך הזה) + התקנת ספריית הסקילים של Salesforce.</w:t>
-      </w:r>
-    </w:p>
-    <w:p>
-      <w:pPr>
-        <w:pStyle w:val="ListBullet"/>
-        <w:spacing w:after="60"/>
-        <w:jc w:val="right"/>
-        <w:bidi/>
-      </w:pPr>
-      <w:r>
-        <w:rPr>
-          <w:rFonts w:ascii="Arial" w:hAnsi="Arial" w:cs="Arial"/>
-          <w:b/>
-          <w:color w:val="032D60"/>
-          <w:sz w:val="22"/>
-          <w:rtl/>
-        </w:rPr>
-        <w:t xml:space="preserve">שלב 1 (MVP) — </w:t>
-      </w:r>
-      <w:r>
-        <w:rPr>
-          <w:rFonts w:ascii="Arial" w:hAnsi="Arial" w:cs="Arial"/>
-          <w:sz w:val="22"/>
-          <w:rtl/>
-        </w:rPr>
-        <w:t>יצירת Form_Response__c + הרשאות, OmniScript ראשון (שדות ליבה, ולידציות, רב-שלבי), שמירה, אתר Experience Cloud ופרסום, ניהול ב-SF.</w:t>
-      </w:r>
-    </w:p>
-    <w:p>
-      <w:pPr>
-        <w:pStyle w:val="ListBullet"/>
-        <w:spacing w:after="60"/>
-        <w:jc w:val="right"/>
-        <w:bidi/>
-      </w:pPr>
-      <w:r>
-        <w:rPr>
-          <w:rFonts w:ascii="Arial" w:hAnsi="Arial" w:cs="Arial"/>
-          <w:b/>
-          <w:color w:val="032D60"/>
-          <w:sz w:val="22"/>
-          <w:rtl/>
-        </w:rPr>
-        <w:t xml:space="preserve">שלב 2 — </w:t>
-      </w:r>
-      <w:r>
-        <w:rPr>
-          <w:rFonts w:ascii="Arial" w:hAnsi="Arial" w:cs="Arial"/>
-          <w:sz w:val="22"/>
-          <w:rtl/>
-        </w:rPr>
-        <w:t>לוגיקה מותנית מלאה, העלאת קבצים, תבנית אירוע + Flow ליצירת קשר ומיילים, מכסות ותאריכים, גלריית תבניות.</w:t>
-      </w:r>
-    </w:p>
-    <w:p>
-      <w:pPr>
-        <w:pStyle w:val="ListBullet"/>
-        <w:spacing w:after="60"/>
-        <w:jc w:val="right"/>
-        <w:bidi/>
-      </w:pPr>
-      <w:r>
-        <w:rPr>
-          <w:rFonts w:ascii="Arial" w:hAnsi="Arial" w:cs="Arial"/>
-          <w:b/>
-          <w:color w:val="032D60"/>
-          <w:sz w:val="22"/>
-          <w:rtl/>
-        </w:rPr>
-        <w:t xml:space="preserve">שלב 3 — </w:t>
-      </w:r>
-      <w:r>
-        <w:rPr>
-          <w:rFonts w:ascii="Arial" w:hAnsi="Arial" w:cs="Arial"/>
-          <w:sz w:val="22"/>
-          <w:rtl/>
-        </w:rPr>
-        <w:t>Case Management ורישוי/היתרים (PSS), Data Cloud, Agentforce, תשלומים, דשבורדים, רב-לשוני ונגישות AA.</w:t>
-      </w:r>
-    </w:p>
-    <w:p>
-      <w:pPr>
-        <w:spacing w:after="80" w:before="240"/>
-        <w:jc w:val="right"/>
-        <w:bidi/>
-      </w:pPr>
-      <w:r>
-        <w:rPr>
-          <w:rFonts w:ascii="Arial" w:hAnsi="Arial" w:cs="Arial"/>
-          <w:b/>
-          <w:i w:val="0"/>
-          <w:color w:val="032D60"/>
-          <w:sz w:val="30"/>
-          <w:rtl/>
-        </w:rPr>
-        <w:t>11. עקרון פיתוח מנחה</w:t>
-      </w:r>
-    </w:p>
-    <w:p>
-      <w:pPr>
-        <w:spacing w:after="120"/>
-        <w:jc w:val="right"/>
-        <w:bidi/>
-      </w:pPr>
-      <w:r>
-        <w:rPr>
-          <w:rFonts w:ascii="Arial" w:hAnsi="Arial" w:cs="Arial"/>
-          <w:b w:val="0"/>
-          <w:i w:val="0"/>
-          <w:sz w:val="22"/>
-          <w:rtl/>
-        </w:rPr>
-        <w:t>לפני כל פיתוח Salesforce (מתועד ב-CLAUDE.md): שימוש בספריית הסקילים הרשמית forcedotcom/sf-skills (87 סקילים, מותקנת בפרויקט), ניצול מלא של יכולות רישוי PSS, והעדפת גישה נייטיבית על פני פתרונות חיצוניים.</w:t>
-      </w:r>
     </w:p>
     <w:sectPr>
       <w:pgSz w:w="11906" w:h="16838"/>
@@ -1389,8 +993,12 @@
     <w:name w:val="Normal"/>
     <w:qFormat/>
     <w:rsid w:val="00FC693F"/>
+    <w:pPr>
+      <w:spacing w:line="300" w:lineRule="auto"/>
+    </w:pPr>
     <w:rPr>
-      <w:rFonts w:ascii="Arial" w:hAnsi="Arial" w:cs="Arial"/>
+      <w:rFonts w:ascii="Segoe UI" w:hAnsi="Segoe UI" w:cs="Segoe UI"/>
+      <w:color w:val="0F172A"/>
       <w:sz w:val="22"/>
     </w:rPr>
   </w:style>

</xml_diff>